<commit_message>
Input map (12 actions, keyboard + gamepad), GUT 9.7.1 test setup, combat GDD v1.0 approved
</commit_message>
<xml_diff>
--- a/docs/GDD_Combate.docx
+++ b/docs/GDD_Combate.docx
@@ -204,7 +204,7 @@
                 <w:sz w:val="19"/>
                 <w:szCs w:val="19"/>
               </w:rPr>
-              <w:t xml:space="preserve">0.1 — proposta para aprovação</w:t>
+              <w:t xml:space="preserve">1.0 — aprovado pelo Diretor (24/09/2026)</w:t>
             </w:r>
           </w:p>
         </w:tc>
@@ -578,7 +578,7 @@
           <w:sz w:val="24"/>
           <w:szCs w:val="24"/>
         </w:rPr>
-        <w:t xml:space="preserve">13. Pontos para aprovação</w:t>
+        <w:t xml:space="preserve">13. Decisões do combate</w:t>
       </w:r>
     </w:p>
     <w:p>
@@ -11325,7 +11325,16 @@
         <w:pageBreakBefore/>
       </w:pPr>
       <w:r>
-        <w:t xml:space="preserve">13. Pontos para aprovação</w:t>
+        <w:t xml:space="preserve">13. Decisões do combate</w:t>
+      </w:r>
+    </w:p>
+    <w:p>
+      <w:pPr>
+        <w:keepNext/>
+        <w:spacing w:after="120"/>
+      </w:pPr>
+      <w:r>
+        <w:t xml:space="preserve">Todas as propostas abaixo foram aprovadas em 24/09/2026.</w:t>
       </w:r>
     </w:p>
     <w:tbl>
@@ -11448,7 +11457,7 @@
                 <w:sz w:val="19"/>
                 <w:szCs w:val="19"/>
               </w:rPr>
-              <w:t xml:space="preserve">Proposta</w:t>
+              <w:t xml:space="preserve">Decisão</w:t>
             </w:r>
           </w:p>
         </w:tc>

</xml_diff>